<commit_message>
Carta: brasão oficial e timbre da Embaixada do Brasil na Irlanda
Co-Authored-By: Claude Sonnet 5.5 <noreply@anthropic.com>
Claude-Session: https://claude.ai/code/session_01Wkykg5acEHoGXQn8jJZPC5
</commit_message>
<xml_diff>
--- a/docs/cartas/modelo_carta_empregador.docx
+++ b/docs/cartas/modelo_carta_empregador.docx
@@ -4,17 +4,48 @@
   <w:body>
     <w:p>
       <w:pPr>
-        <w:spacing w:after="0"/>
+        <w:spacing w:after="80"/>
         <w:jc w:val="center"/>
       </w:pPr>
       <w:r>
-        <w:rPr>
-          <w:rFonts w:ascii="Calibri" w:cs="Calibri" w:eastAsia="Calibri" w:hAnsi="Calibri"/>
-          <w:color w:val="999999"/>
-          <w:sz w:val="16"/>
-          <w:szCs w:val="16"/>
-        </w:rPr>
-        <w:t xml:space="preserve">[ BRASÃO DAS ARMAS DA REPÚBLICA — inserir docs/cartas/brasao.png e rodar o gerador ]</w:t>
+        <w:drawing>
+          <wp:inline distT="0" distB="0" distL="0" distR="0">
+            <wp:extent cx="800100" cy="800100"/>
+            <wp:effectExtent t="0" r="0" b="0" l="0"/>
+            <wp:docPr id="1" name="" descr="" title=""/>
+            <wp:cNvGraphicFramePr>
+              <a:graphicFrameLocks xmlns:a="http://schemas.openxmlformats.org/drawingml/2006/main" noChangeAspect="1"/>
+            </wp:cNvGraphicFramePr>
+            <a:graphic xmlns:a="http://schemas.openxmlformats.org/drawingml/2006/main">
+              <a:graphicData uri="http://schemas.openxmlformats.org/drawingml/2006/picture">
+                <pic:pic xmlns:pic="http://schemas.openxmlformats.org/drawingml/2006/picture">
+                  <pic:nvPicPr>
+                    <pic:cNvPr id="0" name="" descr=""/>
+                    <pic:cNvPicPr>
+                      <a:picLocks noChangeAspect="1" noChangeArrowheads="1"/>
+                    </pic:cNvPicPr>
+                  </pic:nvPicPr>
+                  <pic:blipFill>
+                    <a:blip r:embed="rId7" cstate="none"/>
+                    <a:srcRect/>
+                    <a:stretch>
+                      <a:fillRect/>
+                    </a:stretch>
+                  </pic:blipFill>
+                  <pic:spPr bwMode="auto">
+                    <a:xfrm>
+                      <a:off x="0" y="0"/>
+                      <a:ext cx="800100" cy="800100"/>
+                    </a:xfrm>
+                    <a:prstGeom prst="rect">
+                      <a:avLst/>
+                    </a:prstGeom>
+                  </pic:spPr>
+                </pic:pic>
+              </a:graphicData>
+            </a:graphic>
+          </wp:inline>
+        </w:drawing>
       </w:r>
     </w:p>
     <w:p>
@@ -47,7 +78,7 @@
           <w:sz w:val="20"/>
           <w:szCs w:val="20"/>
         </w:rPr>
-        <w:t xml:space="preserve">Eleições Presidenciais 2026 – Irlanda</w:t>
+        <w:t xml:space="preserve">Embaixada do Brasil na Irlanda</w:t>
       </w:r>
     </w:p>
     <w:p>

</xml_diff>

<commit_message>
Carta: aplica revisões (contato, assinatura, sem frase do TRE) e corrige 'service her performed'
Co-Authored-By: Claude Sonnet 5.5 <noreply@anthropic.com>
Claude-Session: https://claude.ai/code/session_01Wkykg5acEHoGXQn8jJZPC5
</commit_message>
<xml_diff>
--- a/docs/cartas/modelo_carta_empregador.docx
+++ b/docs/cartas/modelo_carta_empregador.docx
@@ -198,20 +198,20 @@
           <w:sz w:val="22"/>
           <w:szCs w:val="22"/>
         </w:rPr>
-        <w:t xml:space="preserve">{{nome_voluntario}} was registered with the Brazilian Electoral Court (TRE) as part of the polling station team. Under Brazilian electoral law (Law No. 9,504/1997, Article 98), citizens who serve at polling stations, or who are called upon to assist them, are entitled to two days of leave, with no loss of pay, for each day worked. We understand that Brazilian law creates no obligation for employers in Ireland, and we do not suggest otherwise. We would, however, be grateful if you could consider, as a courtesy, granting {{nome_voluntario}} additional time off in recognition of the service {{pronome_poss}} performed.</w:t>
-      </w:r>
-    </w:p>
-    <w:p>
-      <w:pPr>
-        <w:spacing w:after="160" w:line="276"/>
-      </w:pPr>
-      <w:r>
-        <w:rPr>
-          <w:rFonts w:ascii="Calibri" w:cs="Calibri" w:eastAsia="Calibri" w:hAnsi="Calibri"/>
-          <w:sz w:val="22"/>
-          <w:szCs w:val="22"/>
-        </w:rPr>
-        <w:t xml:space="preserve">Should you require any confirmation of the dates and hours described above, please do not hesitate to contact us at {{contato}}.</w:t>
+        <w:t xml:space="preserve">Under Brazilian electoral law (Law No. 9,504/1997, Article 98), citizens who serve at polling stations, or who are called upon to assist them, are entitled to two days of leave, with no loss of pay, for each day worked. We understand that Brazilian law creates no obligation for employers in Ireland, and we do not suggest otherwise. We would, however, be grateful if you could consider, as a courtesy, granting {{nome_voluntario}} additional time off in recognition of {{pronome_poss}} service.</w:t>
+      </w:r>
+    </w:p>
+    <w:p>
+      <w:pPr>
+        <w:spacing w:after="160" w:line="276"/>
+      </w:pPr>
+      <w:r>
+        <w:rPr>
+          <w:rFonts w:ascii="Calibri" w:cs="Calibri" w:eastAsia="Calibri" w:hAnsi="Calibri"/>
+          <w:sz w:val="22"/>
+          <w:szCs w:val="22"/>
+        </w:rPr>
+        <w:t xml:space="preserve">Should you require any confirmation of the dates and hours described above, please do not hesitate to contact us at {{contato}}</w:t>
       </w:r>
     </w:p>
     <w:p>
@@ -257,28 +257,15 @@
     </w:p>
     <w:p>
       <w:pPr>
-        <w:spacing w:after="0"/>
-      </w:pPr>
-      <w:r>
-        <w:rPr>
-          <w:rFonts w:ascii="Calibri" w:cs="Calibri" w:eastAsia="Calibri" w:hAnsi="Calibri"/>
-          <w:sz w:val="22"/>
-          <w:szCs w:val="22"/>
-        </w:rPr>
-        <w:t xml:space="preserve">Administrator, 2026 Brazilian Presidential Elections in Ireland</w:t>
-      </w:r>
-    </w:p>
-    <w:p>
-      <w:pPr>
-        <w:spacing w:after="160" w:line="276"/>
-      </w:pPr>
-      <w:r>
-        <w:rPr>
-          <w:rFonts w:ascii="Calibri" w:cs="Calibri" w:eastAsia="Calibri" w:hAnsi="Calibri"/>
-          <w:sz w:val="22"/>
-          <w:szCs w:val="22"/>
-        </w:rPr>
-        <w:t xml:space="preserve">{{contato}}</w:t>
+        <w:spacing w:after="160" w:line="276"/>
+      </w:pPr>
+      <w:r>
+        <w:rPr>
+          <w:rFonts w:ascii="Calibri" w:cs="Calibri" w:eastAsia="Calibri" w:hAnsi="Calibri"/>
+          <w:sz w:val="22"/>
+          <w:szCs w:val="22"/>
+        </w:rPr>
+        <w:t xml:space="preserve">Administrator of the 2026 Brazilian Presidential Elections in Ireland</w:t>
       </w:r>
     </w:p>
     <w:sectPr>

</xml_diff>

<commit_message>
Carta: texto da RevMinistro com pronome da planilha; uma carta por empresa; correção de pronome
Co-Authored-By: Claude Sonnet 5.5 <noreply@anthropic.com>
Claude-Session: https://claude.ai/code/session_01Wkykg5acEHoGXQn8jJZPC5
</commit_message>
<xml_diff>
--- a/docs/cartas/modelo_carta_empregador.docx
+++ b/docs/cartas/modelo_carta_empregador.docx
@@ -172,33 +172,33 @@
           <w:sz w:val="22"/>
           <w:szCs w:val="22"/>
         </w:rPr>
-        <w:t xml:space="preserve">I am writing as the administrator of the 2026 Brazilian Presidential Elections in Ireland, to let you know that your employee, {{nome_voluntario}}, took part in the organisation of the first round of voting held in Dublin on Sunday, 4 October 2026.</w:t>
-      </w:r>
-    </w:p>
-    <w:p>
-      <w:pPr>
-        <w:spacing w:after="160" w:line="276"/>
-      </w:pPr>
-      <w:r>
-        <w:rPr>
-          <w:rFonts w:ascii="Calibri" w:cs="Calibri" w:eastAsia="Calibri" w:hAnsi="Calibri"/>
-          <w:sz w:val="22"/>
-          <w:szCs w:val="22"/>
-        </w:rPr>
-        <w:t xml:space="preserve">On that day, between 06:30 and 18:00, {{nome_voluntario}} served as a polling station worker. This was strictly voluntary work: it was unpaid, and it was carried out on {{pronome_poss}} own time, on a Sunday, in support of an election in which the Brazilian community in Ireland exercises its right to vote. We are very grateful for {{pronome_poss}} commitment.</w:t>
-      </w:r>
-    </w:p>
-    <w:p>
-      <w:pPr>
-        <w:spacing w:after="160" w:line="276"/>
-      </w:pPr>
-      <w:r>
-        <w:rPr>
-          <w:rFonts w:ascii="Calibri" w:cs="Calibri" w:eastAsia="Calibri" w:hAnsi="Calibri"/>
-          <w:sz w:val="22"/>
-          <w:szCs w:val="22"/>
-        </w:rPr>
-        <w:t xml:space="preserve">Under Brazilian electoral law (Law No. 9,504/1997, Article 98), citizens who serve at polling stations, or who are called upon to assist them, are entitled to two days of leave, with no loss of pay, for each day worked. We understand that Brazilian law creates no obligation for employers in Ireland, and we do not suggest otherwise. We would, however, be grateful if you could consider, as a courtesy, granting {{nome_voluntario}} additional time off in recognition of {{pronome_poss}} service.</w:t>
+        <w:t xml:space="preserve">I am writing as the administrator of the 2026 Brazilian Presidential Elections in Ireland, to let you know that your employee, {{nome_voluntario}}, took part in the organisation of the first round of voting held in Dublin on Sunday, 4 October 2026, for which we are extremely grateful.</w:t>
+      </w:r>
+    </w:p>
+    <w:p>
+      <w:pPr>
+        <w:spacing w:after="160" w:line="276"/>
+      </w:pPr>
+      <w:r>
+        <w:rPr>
+          <w:rFonts w:ascii="Calibri" w:cs="Calibri" w:eastAsia="Calibri" w:hAnsi="Calibri"/>
+          <w:sz w:val="22"/>
+          <w:szCs w:val="22"/>
+        </w:rPr>
+        <w:t xml:space="preserve">On that day, between 06:30 and 18:00, {{nome_voluntario}} served as a polling station worker. This was strictly voluntary work: it was unpaid, and it was carried out on {{pronome_poss}} own time, on a Sunday, in support of an election in which the Brazilian community in Ireland exercises its right to vote. We would like to let you know that {{pronome_poss}} work was exceptionally useful and we are very grateful for {{pronome_poss}} commitment.</w:t>
+      </w:r>
+    </w:p>
+    <w:p>
+      <w:pPr>
+        <w:spacing w:after="160" w:line="276"/>
+      </w:pPr>
+      <w:r>
+        <w:rPr>
+          <w:rFonts w:ascii="Calibri" w:cs="Calibri" w:eastAsia="Calibri" w:hAnsi="Calibri"/>
+          <w:sz w:val="22"/>
+          <w:szCs w:val="22"/>
+        </w:rPr>
+        <w:t xml:space="preserve">Under Brazilian electoral law (Law No. 9,504/1997, Article 98), citizens who serve at polling stations, or who are called upon to assist them, are entitled to two days of leave, with no loss of pay, for each day worked. We understand that Brazilian law creates no obligation for employers in Ireland, and we do not suggest otherwise. We would, however, be grateful if you could consider, as a courtesy, granting {{nome_voluntario}} additional time off in recognition of {{pronome_poss}} service, or any other kind of reward you would consider appropriate.</w:t>
       </w:r>
     </w:p>
     <w:p>

</xml_diff>